<commit_message>
Apply approved publication edit to chapter five
Co-authored-by: arena-agent <297053741+arena-agent@users.noreply.github.com>
</commit_message>
<xml_diff>
--- a/publication/Глава_04_publication.docx
+++ b/publication/Глава_04_publication.docx
@@ -1774,13 +1774,7 @@
         <ns0:jc ns0:val="both"/>
       </ns0:pPr>
       <ns0:r>
-        <ns0:rPr>
-          <ns0:rFonts ns0:ascii="Times New Roman" ns0:cs="Times New Roman" ns0:eastAsia="Times New Roman" ns0:hAnsi="Times New Roman"/>
-          <ns0:color ns0:val="1F1F1F"/>
-          <ns0:sz ns0:val="24"/>
-          <ns0:szCs ns0:val="24"/>
-        </ns0:rPr>
-        <ns0:t xml:space="preserve">— Ограниченный. На полгода, в паре, с отчётами. — Ирма прижала папку к груди. — Дали.</ns0:t>
+        <ns0:t>— Полный. Канцелярский. — Ирма прижала папку к груди. — Дали.</ns0:t>
       </ns0:r>
     </ns0:p>
     <ns0:p>
@@ -11488,6 +11482,17 @@
       </ns0:pPr>
       <ns0:r>
         <ns0:t>— На один раз. Я же сказала. — Агнис поморщилась. — Первые две у меня держались по три дня и осыпались сами, просто от того, что лежали. Эта первой пережила четвёртый день. Я три недели билась именно над сроком, а не над тем, чтобы подвеска срабатывала.</ns0:t>
+      </ns0:r>
+    </ns0:p>
+    <ns0:p>
+      <ns0:pPr>
+        <ns0:widowControl/>
+        <ns0:spacing ns0:before="0" ns0:after="0" ns0:line="360"/>
+        <ns0:ind ns0:firstLine="709"/>
+        <ns0:jc ns0:val="both"/>
+      </ns0:pPr>
+      <ns0:r>
+        <ns0:t>— И ещё: если твоя сработает, моя нагреется. Ненадолго, но я пойму. Я их вместе сводила.</ns0:t>
       </ns0:r>
     </ns0:p>
     <ns0:p>

</xml_diff>